<commit_message>
barlow/finesst: proofread + solicitation-compliance fixes (v9 + tracked)
Applied to v9 and mirrored as tracked changes in v9_tracked (accept-all
still equals v9, verified programmatically):
- name the SMD Division + programs in NASA Relevance (required element)
- finish the truncated Figure 1 caption; remove the 'reference for this
  as well' editing artifact; fix the backwards hypothesis-falsification
  sentence; sediment movement -> channel change (consistent hypothesis)
- cite previously-uncited refs [3] and [5]; 20 -> 21 gauged streams;
  repair the repeat-acquisition/valley-wide sentence; LiDAR -> lidar;
  hyphenation, heading colon, en-dash, comma cleanups
- DAPR metadata: blank lastModifiedBy (was Craig Glennie) in v9,
  v9_tracked, and both submission-package copies (metadata only)

Font-density question (11pt Calibri ~17 cpi vs 15 cpi cap) left open
for the user. Changelog updated in glennie_comment_responses_v8.md.

Co-Authored-By: Claude Fable 5 <noreply@anthropic.com>
</commit_message>
<xml_diff>
--- a/barlow/docs/finesst_proposal_v9.docx
+++ b/barlow/docs/finesst_proposal_v9.docx
@@ -125,7 +125,23 @@
           <w:color w:val="404040"/>
           <w:sz w:val="18"/>
         </w:rPr>
-        <w:t xml:space="preserve">Figure 1. Study area. (A) The McMurdo Dry Valleys within Antarctica (coastline: Natural Earth). (B) Hillshade of the study-area lidar DEM (1 m), showing the incised valley-floor channels this project measures; </w:t>
+        <w:t xml:space="preserve">Figure 1. Study area. (A) The McMurdo Dry Valleys within Antarctica (coastline: Natural Earth). (B) Hillshade of the study-area lidar DEM (1 m), showing the incised valley-floor channels this project measures</w:t>
+      </w:r>
+      <w:r>
+        <w:rPr>
+          <w:i/>
+          <w:color w:val="404040"/>
+          <w:sz w:val="18"/>
+        </w:rPr>
+        <w:t xml:space="preserve">.</w:t>
+      </w:r>
+      <w:r>
+        <w:rPr>
+          <w:i/>
+          <w:color w:val="404040"/>
+          <w:sz w:val="18"/>
+        </w:rPr>
+        <w:t xml:space="preserve"> </w:t>
       </w:r>
     </w:p>
     <w:p>
@@ -175,10 +191,19 @@
         <w:t xml:space="preserve">ML methodology </w:t>
       </w:r>
       <w:r>
+        <w:t xml:space="preserve">[5] </w:t>
+      </w:r>
+      <w:r>
         <w:t xml:space="preserve">that finds stream channels </w:t>
       </w:r>
       <w:r>
-        <w:t>using high resolution terrain</w:t>
+        <w:t xml:space="preserve">using high</w:t>
+      </w:r>
+      <w:r>
+        <w:t xml:space="preserve">-</w:t>
+      </w:r>
+      <w:r>
+        <w:t xml:space="preserve">resolution terrain</w:t>
       </w:r>
       <w:r>
         <w:t xml:space="preserve"> (elevation, slope, aspect)</w:t>
@@ -199,7 +224,13 @@
         </w:rPr>
       </w:pPr>
       <w:r>
-        <w:t>Initial verification that repeat acquisition and valley wide REMA (Reference Elevation Model of Antarctica) satellite DEMs [4] are precise and high-resolution enough to detect stream-corridor change once aligned to external control.</w:t>
+        <w:t xml:space="preserve">Initial verification that repeat</w:t>
+      </w:r>
+      <w:r>
+        <w:t xml:space="preserve">-acquisition airborne lidar and valley-</w:t>
+      </w:r>
+      <w:r>
+        <w:t xml:space="preserve">wide REMA (Reference Elevation Model of Antarctica) satellite DEMs [4] are precise and high-resolution enough to detect stream-corridor change once aligned to external control.</w:t>
       </w:r>
       <w:r/>
       <w:r/>
@@ -306,7 +337,31 @@
         </w:rPr>
       </w:pPr>
       <w:r>
-        <w:t>The 2001 baseline is NASA data — an airborne LiDAR swath never fully exploited for surface change – reference for this as well [8]. The project turns the airborne lidar, REMA satellite DEMs (corrected and controlled by airborne lidar and ICESat-2 observations) and reanalysis, into a continuing, uncertainty-calibrated record of climate-driven surface change in the Dry Valleys. The methods travel beyond the site to any elevation-differencing problem, including the surface-change records NASA missions such as ICESat-2 and NISAR produce. The analysis will also enable future change detection from the high resolution terrain observations resulting from the possible future Surface Topography and Vegetation (STV) observing system. The Dry Valleys are also the canonical terrestrial analog for cold-desert planetary surfaces such as Mars. The proposed research also develops the skills NASA's open-science strategy calls for: open geospatial data, machine learning on remote sensing, and honest uncertainty.</w:t>
+        <w:t xml:space="preserve">The </w:t>
+      </w:r>
+      <w:r>
+        <w:t xml:space="preserve">proposed research is relevant to NASA’s Earth Science Division — most directly the Cryospheric Sciences and Terrestrial Hydrology programs, which support research on cold-region surface change and meltwater hydrology. The </w:t>
+      </w:r>
+      <w:r>
+        <w:t xml:space="preserve">2001 baseline is NASA data — an airborne </w:t>
+      </w:r>
+      <w:r>
+        <w:t xml:space="preserve">lidar</w:t>
+      </w:r>
+      <w:r>
+        <w:t xml:space="preserve"> swath never fully exploited for surface change </w:t>
+      </w:r>
+      <w:r>
+        <w:t xml:space="preserve">[8]. The project turns the airborne lidar, REMA satellite DEMs (corrected and controlled by airborne lidar and ICESat-2 observations) and reanalysis</w:t>
+      </w:r>
+      <w:r>
+        <w:t xml:space="preserve"> into a continuing, uncertainty-calibrated record of climate-driven surface change in the Dry Valleys. The methods travel beyond the site to any elevation-differencing problem, including the surface-change records NASA missions such as ICESat-2 and NISAR produce. The analysis will also enable future change detection from the high</w:t>
+      </w:r>
+      <w:r>
+        <w:t xml:space="preserve">-</w:t>
+      </w:r>
+      <w:r>
+        <w:t xml:space="preserve">resolution terrain observations resulting from the possible future Surface Topography and Vegetation (STV) observing system. The Dry Valleys are also the canonical terrestrial analog for cold-desert planetary surfaces such as Mars. The proposed research also develops the skills NASA's open-science strategy calls for: open geospatial data, machine learning on remote sensing, and honest uncertainty.</w:t>
       </w:r>
       <w:r/>
       <w:r/>
@@ -368,7 +423,19 @@
         </w:numPr>
       </w:pPr>
       <w:r>
-        <w:t>Attribution. Determination of which climate drivers control each stream's rate of geomorphic change. Candidate drivers — air temperature, incoming sunlight, meltwater discharge, glacial mass balance, and summer thaw — come from the McMurdo Dry Valleys LTER network (meteorology, stream gauges, glacier mass balance, and soil climate) [6], with ERA5 [7] and AMPS reanalysis filling coverage gaps. We hypothesize that melt energy will predict sediment movement better than water volume alone. The hypothesis is testable: if discharge alone correlates with channel migration rate then the hypothesis fails.</w:t>
+        <w:t xml:space="preserve">Attribution. Determination of which climate drivers control each stream's rate of geomorphic change. Candidate drivers — air temperature, incoming sunlight, meltwater discharge, glacial mass balance, and summer thaw — come from the McMurdo Dry Valleys LTER network (meteorology, stream gauges, glacier mass balance, and soil climate) [6], with ERA5 [7] and AMPS reanalysis filling coverage gaps. We hypothesize that melt energy will predict </w:t>
+      </w:r>
+      <w:r>
+        <w:t xml:space="preserve">channel change</w:t>
+      </w:r>
+      <w:r>
+        <w:t xml:space="preserve"> better than water volume alone. The hypothesis is testable: if discharge alone </w:t>
+      </w:r>
+      <w:r>
+        <w:t xml:space="preserve">predicts channel migration as well as or better than melt energy,</w:t>
+      </w:r>
+      <w:r>
+        <w:t xml:space="preserve"> the hypothesis fails.</w:t>
       </w:r>
       <w:r/>
       <w:r/>
@@ -422,8 +489,13 @@
         <w:ind w:left="720"/>
       </w:pPr>
       <w:r>
-        <w:lastRenderedPageBreak/>
-        <w:t>The satellite record past 2014 exists only on the free REMA DEM, whose elevations are tricky to combine with LiDAR in terrain-dependent ways. Correcting that is part of the method, not a chief objective.</w:t>
+        <w:t xml:space="preserve">The satellite record past 2014 exists only on the free REMA DEM, whose elevations are tricky to combine with </w:t>
+      </w:r>
+      <w:r>
+        <w:t xml:space="preserve">lidar</w:t>
+      </w:r>
+      <w:r>
+        <w:t xml:space="preserve"> in terrain-dependent ways. Correcting that is part of the method, not a chief objective.</w:t>
       </w:r>
     </w:p>
     <w:p>
@@ -655,7 +727,13 @@
         </w:numPr>
       </w:pPr>
       <w:r>
-        <w:t>As mentioned before, I measure the REMA-minus-LiDAR difference over stable ground, model it against slope and aspect, and remove that bias before mixing the two sensors in any differencing.</w:t>
+        <w:t xml:space="preserve">As mentioned before, I measure the REMA-minus-</w:t>
+      </w:r>
+      <w:r>
+        <w:t xml:space="preserve">lidar</w:t>
+      </w:r>
+      <w:r>
+        <w:t xml:space="preserve"> difference over stable ground, model it against slope and aspect, and remove that bias before mixing the two sensors in any differencing.</w:t>
       </w:r>
     </w:p>
     <w:p>
@@ -664,7 +742,14 @@
           <w:b/>
           <w:sz w:val="24"/>
         </w:rPr>
-        <w:t>Objective 3</w:t>
+        <w:t xml:space="preserve">Objective 3</w:t>
+      </w:r>
+      <w:r>
+        <w:rPr>
+          <w:b/>
+          <w:sz w:val="24"/>
+        </w:rPr>
+        <w:t xml:space="preserve">:</w:t>
       </w:r>
     </w:p>
     <w:p>
@@ -702,7 +787,13 @@
     </w:p>
     <w:p>
       <w:r>
-        <w:t>Note that all methods use robust statistics, since elevation errors here are heavy-tailed and an ordinary standard deviation would be thrown off by a few blunders. The noise scale throughout is the NMAD (1.4826 times the median absolute deviation from the median). For a single surface the detection floor is LOD95 = 1.96 x NMAD; since a difference subtracts two noisy surfaces, their NMADs add in quadrature, so the differencing floor is 1.96 x sqrt(NMAD1^2 + NMAD2^2), the change that noise alone clears only 5% of the time. Everything (DEMs, channel outlines, driver fields) is reprojected to one common Antarctic polar-stereographic grid (EPSG:3294) first, and the two lidar epochs (2 m and 1 m native) are resampled to a shared cell size before differencing.</w:t>
+        <w:t xml:space="preserve">Note that all methods use robust statistics</w:t>
+      </w:r>
+      <w:r>
+        <w:t xml:space="preserve"> [3]</w:t>
+      </w:r>
+      <w:r>
+        <w:t xml:space="preserve">, since elevation errors here are heavy-tailed and an ordinary standard deviation would be thrown off by a few blunders. The noise scale throughout is the NMAD (1.4826 times the median absolute deviation from the median). For a single surface the detection floor is LOD95 = 1.96 x NMAD; since a difference subtracts two noisy surfaces, their NMADs add in quadrature, so the differencing floor is 1.96 x sqrt(NMAD1^2 + NMAD2^2), the change that noise alone clears only 5% of the time. Everything (DEMs, channel outlines, driver fields) is reprojected to one common Antarctic polar-stereographic grid (EPSG:3294) first, and the two lidar epochs (2 m and 1 m native) are resampled to a shared cell size before differencing.</w:t>
       </w:r>
     </w:p>
     <w:p>
@@ -724,7 +815,10 @@
         <w:t>All data is free</w:t>
       </w:r>
       <w:r>
-        <w:t>ly available, or has been given with permission from the author.</w:t>
+        <w:t xml:space="preserve">ly available</w:t>
+      </w:r>
+      <w:r>
+        <w:t xml:space="preserve"> or has been given with permission from the author.</w:t>
       </w:r>
     </w:p>
     <w:tbl>
@@ -1389,7 +1483,13 @@
     </w:p>
     <w:p>
       <w:r>
-        <w:t>The signal may be weak. With roughly 20 gauged streams and only 3 epochs, the sample is small. If no driver clearly outperforms another, the deliverable becomes a rigorous null result with calibrated uncertainty — useful, if less exciting. The risk is to impact, not feasibility.</w:t>
+        <w:t xml:space="preserve">The signal may be weak. With </w:t>
+      </w:r>
+      <w:r>
+        <w:t xml:space="preserve">21</w:t>
+      </w:r>
+      <w:r>
+        <w:t xml:space="preserve"> gauged streams and only 3 epochs, the sample is small. If no driver clearly outperforms another, the deliverable becomes a rigorous null result with calibrated uncertainty — useful, if less exciting. The risk is to impact, not feasibility.</w:t>
       </w:r>
     </w:p>
     <w:p>
@@ -1436,7 +1536,13 @@
     </w:p>
     <w:p>
       <w:r>
-        <w:t>Even so, the proposal is worth doing. The MDV streams are the most direct, measurable climate response in one of Earth's most stable landscapes, and the data — two LiDAR epochs, a satellite record, and LTER station records — already exist and are free.</w:t>
+        <w:t xml:space="preserve">Even so, the proposal is worth doing. The MDV streams are the most direct, measurable climate response in one of Earth's most stable landscapes, and the data — two </w:t>
+      </w:r>
+      <w:r>
+        <w:t xml:space="preserve">lidar</w:t>
+      </w:r>
+      <w:r>
+        <w:t xml:space="preserve"> epochs, a satellite record, and LTER station records — already exist and are free.</w:t>
       </w:r>
     </w:p>
     <w:p/>
@@ -1912,7 +2018,19 @@
         <w:rPr>
           <w:rFonts w:ascii="Calibri" w:hAnsi="Calibri"/>
         </w:rPr>
-        <w:t>[8] Schenk, T., Csatho, B., Ahn, Y., Yoon, T., Shin, S. W., &amp; Huh, K. I. (2004). DEM generation from the Antarctic LiDAR data: Site report. US Geological Survey.</w:t>
+        <w:t xml:space="preserve">[8] Schenk, T., Csatho, B., Ahn, Y., Yoon, T., Shin, S. W., &amp; Huh, K. I. (2004). DEM generation from the Antarctic </w:t>
+      </w:r>
+      <w:r>
+        <w:rPr>
+          <w:rFonts w:ascii="Calibri" w:hAnsi="Calibri"/>
+        </w:rPr>
+        <w:t xml:space="preserve">lidar</w:t>
+      </w:r>
+      <w:r>
+        <w:rPr>
+          <w:rFonts w:ascii="Calibri" w:hAnsi="Calibri"/>
+        </w:rPr>
+        <w:t xml:space="preserve"> data: Site report. US Geological Survey.</w:t>
       </w:r>
       <w:r>
         <w:rPr>
@@ -1934,7 +2052,19 @@
         <w:rPr>
           <w:rFonts w:ascii="Calibri" w:hAnsi="Calibri"/>
         </w:rPr>
-        <w:t>[9] Fountain, A. G., et al. (1999). Physical controls on the Taylor Valley ecosystem, Antarctica. BioScience 49(12):961-971.</w:t>
+        <w:t xml:space="preserve">[9] Fountain, A. G., et al. (1999). Physical controls on the Taylor Valley ecosystem, Antarctica. BioScience 49(12):961</w:t>
+      </w:r>
+      <w:r>
+        <w:rPr>
+          <w:rFonts w:ascii="Calibri" w:hAnsi="Calibri"/>
+        </w:rPr>
+        <w:t xml:space="preserve">–</w:t>
+      </w:r>
+      <w:r>
+        <w:rPr>
+          <w:rFonts w:ascii="Calibri" w:hAnsi="Calibri"/>
+        </w:rPr>
+        <w:t xml:space="preserve">971.</w:t>
       </w:r>
       <w:r>
         <w:rPr>

</xml_diff>